<commit_message>
Day11-Critic: guard core AI call against failure, add project.md
InvokePromptAsync was unguarded - a bad key, rate limit, network
issue, or content-safety rejection would crash the whole session.
Wraps it in try/catch. Syncs the docx's Complete Code listing and
replaces missing.md with project.md.
</commit_message>
<xml_diff>
--- a/Day11-Critic.docx
+++ b/Day11-Critic.docx
@@ -1230,68 +1230,254 @@
           <w:sz w:val="19"/>
         </w:rPr>
       </w:pPr>
-      <w:r>
-        <w:rPr>
-          <w:rFonts w:ascii="Consolas" w:hAnsi="Consolas"/>
-          <w:sz w:val="19"/>
-        </w:rPr>
-        <w:t xml:space="preserve">            var result = await kernel.InvokePromptAsync(criticPrompt, arguments);</w:t>
-      </w:r>
-    </w:p>
-    <w:p>
-      <w:pPr>
-        <w:pStyle w:val="NoSpacing"/>
-        <w:rPr>
-          <w:rFonts w:ascii="Consolas" w:hAnsi="Consolas"/>
-          <w:sz w:val="19"/>
-        </w:rPr>
-      </w:pPr>
-    </w:p>
-    <w:p>
-      <w:pPr>
-        <w:pStyle w:val="NoSpacing"/>
-        <w:rPr>
-          <w:rFonts w:ascii="Consolas" w:hAnsi="Consolas"/>
-          <w:sz w:val="19"/>
-        </w:rPr>
-      </w:pPr>
-      <w:r>
-        <w:rPr>
-          <w:rFonts w:ascii="Consolas" w:hAnsi="Consolas"/>
-          <w:sz w:val="19"/>
-        </w:rPr>
-        <w:t xml:space="preserve">            Console.WriteLine("--- Critique Result ---");</w:t>
-      </w:r>
-    </w:p>
-    <w:p>
-      <w:pPr>
-        <w:pStyle w:val="NoSpacing"/>
-        <w:rPr>
-          <w:rFonts w:ascii="Consolas" w:hAnsi="Consolas"/>
-          <w:sz w:val="19"/>
-        </w:rPr>
-      </w:pPr>
-      <w:r>
-        <w:rPr>
-          <w:rFonts w:ascii="Consolas" w:hAnsi="Consolas"/>
-          <w:sz w:val="19"/>
-        </w:rPr>
-        <w:t xml:space="preserve">            Console.WriteLine(result.ToString().Trim());</w:t>
-      </w:r>
-    </w:p>
-    <w:p>
-      <w:pPr>
-        <w:pStyle w:val="NoSpacing"/>
-        <w:rPr>
-          <w:rFonts w:ascii="Consolas" w:hAnsi="Consolas"/>
-          <w:sz w:val="19"/>
-        </w:rPr>
-      </w:pPr>
-      <w:r>
-        <w:rPr>
-          <w:rFonts w:ascii="Consolas" w:hAnsi="Consolas"/>
-          <w:sz w:val="19"/>
-        </w:rPr>
+    </w:p>
+    <w:p>
+      <w:pPr>
+        <w:pStyle w:val="NoSpacing"/>
+        <w:rPr>
+          <w:rFonts w:ascii="Consolas" w:hAnsi="Consolas"/>
+          <w:sz w:val="19"/>
+        </w:rPr>
+      </w:pPr>
+      <w:r>
+        <w:rPr>
+          <w:rFonts w:ascii="Consolas" w:hAnsi="Consolas"/>
+          <w:sz w:val="19"/>
+        </w:rPr>
+        <w:t xml:space="preserve">            // 5. A live API call can fail (bad key, rate limit, network, content</w:t>
+      </w:r>
+    </w:p>
+    <w:p>
+      <w:pPr>
+        <w:pStyle w:val="NoSpacing"/>
+        <w:rPr>
+          <w:rFonts w:ascii="Consolas" w:hAnsi="Consolas"/>
+          <w:sz w:val="19"/>
+        </w:rPr>
+      </w:pPr>
+      <w:r>
+        <w:rPr>
+          <w:rFonts w:ascii="Consolas" w:hAnsi="Consolas"/>
+          <w:sz w:val="19"/>
+        </w:rPr>
+        <w:t xml:space="preserve">            // safety rejection). Catch it so students get a clear message instead</w:t>
+      </w:r>
+    </w:p>
+    <w:p>
+      <w:pPr>
+        <w:pStyle w:val="NoSpacing"/>
+        <w:rPr>
+          <w:rFonts w:ascii="Consolas" w:hAnsi="Consolas"/>
+          <w:sz w:val="19"/>
+        </w:rPr>
+      </w:pPr>
+      <w:r>
+        <w:rPr>
+          <w:rFonts w:ascii="Consolas" w:hAnsi="Consolas"/>
+          <w:sz w:val="19"/>
+        </w:rPr>
+        <w:t xml:space="preserve">            // of an unhandled exception crashing the whole session.</w:t>
+      </w:r>
+    </w:p>
+    <w:p>
+      <w:pPr>
+        <w:pStyle w:val="NoSpacing"/>
+        <w:rPr>
+          <w:rFonts w:ascii="Consolas" w:hAnsi="Consolas"/>
+          <w:sz w:val="19"/>
+        </w:rPr>
+      </w:pPr>
+      <w:r>
+        <w:rPr>
+          <w:rFonts w:ascii="Consolas" w:hAnsi="Consolas"/>
+          <w:sz w:val="19"/>
+        </w:rPr>
+        <w:t xml:space="preserve">            try</w:t>
+      </w:r>
+    </w:p>
+    <w:p>
+      <w:pPr>
+        <w:pStyle w:val="NoSpacing"/>
+        <w:rPr>
+          <w:rFonts w:ascii="Consolas" w:hAnsi="Consolas"/>
+          <w:sz w:val="19"/>
+        </w:rPr>
+      </w:pPr>
+      <w:r>
+        <w:rPr>
+          <w:rFonts w:ascii="Consolas" w:hAnsi="Consolas"/>
+          <w:sz w:val="19"/>
+        </w:rPr>
+        <w:t xml:space="preserve">            {</w:t>
+      </w:r>
+    </w:p>
+    <w:p>
+      <w:pPr>
+        <w:pStyle w:val="NoSpacing"/>
+        <w:rPr>
+          <w:rFonts w:ascii="Consolas" w:hAnsi="Consolas"/>
+          <w:sz w:val="19"/>
+        </w:rPr>
+      </w:pPr>
+      <w:r>
+        <w:rPr>
+          <w:rFonts w:ascii="Consolas" w:hAnsi="Consolas"/>
+          <w:sz w:val="19"/>
+        </w:rPr>
+        <w:t xml:space="preserve">                var result = await kernel.InvokePromptAsync(criticPrompt, arguments);</w:t>
+      </w:r>
+    </w:p>
+    <w:p>
+      <w:pPr>
+        <w:pStyle w:val="NoSpacing"/>
+        <w:rPr>
+          <w:rFonts w:ascii="Consolas" w:hAnsi="Consolas"/>
+          <w:sz w:val="19"/>
+        </w:rPr>
+      </w:pPr>
+    </w:p>
+    <w:p>
+      <w:pPr>
+        <w:pStyle w:val="NoSpacing"/>
+        <w:rPr>
+          <w:rFonts w:ascii="Consolas" w:hAnsi="Consolas"/>
+          <w:sz w:val="19"/>
+        </w:rPr>
+      </w:pPr>
+      <w:r>
+        <w:rPr>
+          <w:rFonts w:ascii="Consolas" w:hAnsi="Consolas"/>
+          <w:sz w:val="19"/>
+        </w:rPr>
+        <w:t xml:space="preserve">                Console.WriteLine("--- Critique Result ---");</w:t>
+      </w:r>
+    </w:p>
+    <w:p>
+      <w:pPr>
+        <w:pStyle w:val="NoSpacing"/>
+        <w:rPr>
+          <w:rFonts w:ascii="Consolas" w:hAnsi="Consolas"/>
+          <w:sz w:val="19"/>
+        </w:rPr>
+      </w:pPr>
+      <w:r>
+        <w:rPr>
+          <w:rFonts w:ascii="Consolas" w:hAnsi="Consolas"/>
+          <w:sz w:val="19"/>
+        </w:rPr>
+        <w:t xml:space="preserve">                Console.WriteLine(result.ToString().Trim());</w:t>
+      </w:r>
+    </w:p>
+    <w:p>
+      <w:pPr>
+        <w:pStyle w:val="NoSpacing"/>
+        <w:rPr>
+          <w:rFonts w:ascii="Consolas" w:hAnsi="Consolas"/>
+          <w:sz w:val="19"/>
+        </w:rPr>
+      </w:pPr>
+      <w:r>
+        <w:rPr>
+          <w:rFonts w:ascii="Consolas" w:hAnsi="Consolas"/>
+          <w:sz w:val="19"/>
+        </w:rPr>
+        <w:t xml:space="preserve">            }</w:t>
+      </w:r>
+    </w:p>
+    <w:p>
+      <w:pPr>
+        <w:pStyle w:val="NoSpacing"/>
+        <w:rPr>
+          <w:rFonts w:ascii="Consolas" w:hAnsi="Consolas"/>
+          <w:sz w:val="19"/>
+        </w:rPr>
+      </w:pPr>
+      <w:r>
+        <w:rPr>
+          <w:rFonts w:ascii="Consolas" w:hAnsi="Consolas"/>
+          <w:sz w:val="19"/>
+        </w:rPr>
+        <w:t xml:space="preserve">            catch (Exception ex)</w:t>
+      </w:r>
+    </w:p>
+    <w:p>
+      <w:pPr>
+        <w:pStyle w:val="NoSpacing"/>
+        <w:rPr>
+          <w:rFonts w:ascii="Consolas" w:hAnsi="Consolas"/>
+          <w:sz w:val="19"/>
+        </w:rPr>
+      </w:pPr>
+      <w:r>
+        <w:rPr>
+          <w:rFonts w:ascii="Consolas" w:hAnsi="Consolas"/>
+          <w:sz w:val="19"/>
+        </w:rPr>
+        <w:t xml:space="preserve">            {</w:t>
+      </w:r>
+    </w:p>
+    <w:p>
+      <w:pPr>
+        <w:pStyle w:val="NoSpacing"/>
+        <w:rPr>
+          <w:rFonts w:ascii="Consolas" w:hAnsi="Consolas"/>
+          <w:sz w:val="19"/>
+        </w:rPr>
+      </w:pPr>
+      <w:r>
+        <w:rPr>
+          <w:rFonts w:ascii="Consolas" w:hAnsi="Consolas"/>
+          <w:sz w:val="19"/>
+        </w:rPr>
+        <w:t xml:space="preserve">                Console.WriteLine("Critique failed - see error below:");</w:t>
+      </w:r>
+    </w:p>
+    <w:p>
+      <w:pPr>
+        <w:pStyle w:val="NoSpacing"/>
+        <w:rPr>
+          <w:rFonts w:ascii="Consolas" w:hAnsi="Consolas"/>
+          <w:sz w:val="19"/>
+        </w:rPr>
+      </w:pPr>
+      <w:r>
+        <w:rPr>
+          <w:rFonts w:ascii="Consolas" w:hAnsi="Consolas"/>
+          <w:sz w:val="19"/>
+        </w:rPr>
+        <w:t xml:space="preserve">                Console.WriteLine(ex.Message);</w:t>
+      </w:r>
+    </w:p>
+    <w:p>
+      <w:pPr>
+        <w:pStyle w:val="NoSpacing"/>
+        <w:rPr>
+          <w:rFonts w:ascii="Consolas" w:hAnsi="Consolas"/>
+          <w:sz w:val="19"/>
+        </w:rPr>
+      </w:pPr>
+      <w:r>
+        <w:rPr>
+          <w:rFonts w:ascii="Consolas" w:hAnsi="Consolas"/>
+          <w:sz w:val="19"/>
+        </w:rPr>
+        <w:t xml:space="preserve">            }</w:t>
+      </w:r>
+    </w:p>
+    <w:p>
+      <w:pPr>
+        <w:pStyle w:val="NoSpacing"/>
+        <w:rPr>
+          <w:rFonts w:ascii="Consolas" w:hAnsi="Consolas"/>
+          <w:sz w:val="19"/>
+        </w:rPr>
+      </w:pPr>
+      <w:r>
+        <w:rPr>
+          <w:rFonts w:ascii="Consolas" w:hAnsi="Consolas"/>
+          <w:sz w:val="19"/>
+        </w:rPr>
+        <w:lastRenderedPageBreak/>
         <w:t xml:space="preserve">        }</w:t>
       </w:r>
     </w:p>
@@ -1344,11 +1530,56 @@
         <w:t>Step 1: The Now-Familiar Kernel Setup.</w:t>
       </w:r>
       <w:r>
-        <w:t xml:space="preserve"> As in every prior lesson, `Kernel.CreateBuilder()` reads the API key and registers `AddGoogleAIGeminiChatCompletion`. Note that unlike </w:t>
-      </w:r>
-      <w:r>
+        <w:t xml:space="preserve"> As in every prior lesson, `Kernel.CreateBuilder()` reads the API key and registers `AddGoogleAIGeminiChatCompletion`. Note that unlike Days 9 and 10, this program never calls `kernel.GetRequiredService&lt;IChatCompletionService&gt;()` directly — it goes straight through `kernel.InvokePromptAsync`, which resolves the chat service internally. This is a reminder that Semantic Kernel offers more than one entry point to the same underlying model call.</w:t>
+      </w:r>
+    </w:p>
+    <w:p/>
+    <w:p>
+      <w:r>
+        <w:rPr>
+          <w:b/>
+        </w:rPr>
+        <w:t>Step 2: A Deliberately Broken Sample.</w:t>
+      </w:r>
+      <w:r>
+        <w:t xml:space="preserve"> `codeToReview` is a small, intentionally flawed method: `a / b` with no guard against `b == 0`, which will throw a `DivideByZeroException` at runtime. This bug exists specifically so the critic has something real to catch — the lesson is only convincing if the "reliability" criterion in the rubric actually has a violation to find.</w:t>
+      </w:r>
+    </w:p>
+    <w:p/>
+    <w:p>
+      <w:r>
+        <w:rPr>
+          <w:b/>
+        </w:rPr>
+        <w:t>Step 3: A Prompt String That Plays Both Roles.</w:t>
+      </w:r>
+      <w:r>
+        <w:t xml:space="preserve"> Rather than constructing a `ChatHistory` with a system message and then adding a user message, `criticPrompt` embeds `System:` and `User:` labels as plain text inside one big string, ending with the `{{$input}}` template placeholder. This works because `kernel.InvokePromptAsync` treats the whole string as the prompt sent to the model — the model itself is capable of interpreting textual role labels even when they aren't passed via the SDK's structured `ChatHistory` roles. It's a useful, if slightly informal, technique to know exists.</w:t>
+      </w:r>
+    </w:p>
+    <w:p/>
+    <w:p>
+      <w:r>
+        <w:rPr>
+          <w:b/>
+        </w:rPr>
+        <w:t>Step 4: Specifying the Output Contract, In Plain English.</w:t>
+      </w:r>
+      <w:r>
+        <w:t xml:space="preserve"> The `SCORE:/PROS:/CONS:/FIX:` block in the prompt is the entire mechanism by which this program gets "structured" output — there is no JSON schema, no response format enum, nothing enforced by the SDK. The model is simply told, very explicitly, what shape its answer must take, and a well-instructed model reliably complies. The code comment at the top of the file flags this directly: true structured (JSON) output is deferred to Days 19/21, and this lesson exists to show the "prompt discipline" alternative first.</w:t>
+      </w:r>
+    </w:p>
+    <w:p/>
+    <w:p>
+      <w:r>
+        <w:rPr>
+          <w:b/>
+        </w:rPr>
         <w:lastRenderedPageBreak/>
-        <w:t>Days 9 and 10, this program never calls `kernel.GetRequiredService&lt;IChatCompletionService&gt;()` directly — it goes straight through `kernel.InvokePromptAsync`, which resolves the chat service internally. This is a reminder that Semantic Kernel offers more than one entry point to the same underlying model call.</w:t>
+        <w:t>Step 5: Temperature Zero for a Consistent Verdict.</w:t>
+      </w:r>
+      <w:r>
+        <w:t xml:space="preserve"> `Temperature = 0.0, TopP = 0.1` pushes the model as close to fully deterministic as the API allows. A code critic that gives a different score every time it reviews the exact same snippet would undermine trust in the tool — this is the most literal application yet in the course of "tune temperature to match the task's need for consistency versus creativity."</w:t>
       </w:r>
     </w:p>
     <w:p/>
@@ -1357,55 +1588,6 @@
         <w:rPr>
           <w:b/>
         </w:rPr>
-        <w:t>Step 2: A Deliberately Broken Sample.</w:t>
-      </w:r>
-      <w:r>
-        <w:t xml:space="preserve"> `codeToReview` is a small, intentionally flawed method: `a / b` with no guard against `b == 0`, which will throw a `DivideByZeroException` at runtime. This bug exists specifically so the critic has something real to catch — the lesson is only convincing if the "reliability" criterion in the rubric actually has a violation to find.</w:t>
-      </w:r>
-    </w:p>
-    <w:p/>
-    <w:p>
-      <w:r>
-        <w:rPr>
-          <w:b/>
-        </w:rPr>
-        <w:t>Step 3: A Prompt String That Plays Both Roles.</w:t>
-      </w:r>
-      <w:r>
-        <w:t xml:space="preserve"> Rather than constructing a `ChatHistory` with a system message and then adding a user message, `criticPrompt` embeds `System:` and `User:` labels as plain text inside one big string, ending with the `{{$input}}` template placeholder. This works because `kernel.InvokePromptAsync` treats the whole string as the prompt sent to the model — the model itself is capable of interpreting textual role labels even when they aren't passed via the SDK's structured `ChatHistory` roles. It's a useful, if slightly informal, technique to know exists.</w:t>
-      </w:r>
-    </w:p>
-    <w:p/>
-    <w:p>
-      <w:r>
-        <w:rPr>
-          <w:b/>
-        </w:rPr>
-        <w:t>Step 4: Specifying the Output Contract, In Plain English.</w:t>
-      </w:r>
-      <w:r>
-        <w:t xml:space="preserve"> The `SCORE:/PROS:/CONS:/FIX:` block in the prompt is the entire mechanism by which this program gets "structured" output — there is no JSON schema, no response format enum, nothing enforced by the SDK. The model is simply told, very explicitly, what shape its answer must take, and a well-instructed model reliably complies. The code comment at the top of the file flags this directly: true structured (JSON) output is deferred to Days 19/21, and this lesson exists to show the "prompt discipline" alternative first.</w:t>
-      </w:r>
-    </w:p>
-    <w:p/>
-    <w:p>
-      <w:r>
-        <w:rPr>
-          <w:b/>
-        </w:rPr>
-        <w:t>Step 5: Temperature Zero for a Consistent Verdict.</w:t>
-      </w:r>
-      <w:r>
-        <w:t xml:space="preserve"> `Temperature = 0.0, TopP = 0.1` pushes the model as close to fully deterministic as the API allows. A code critic that gives a different score every time it reviews the exact same snippet would undermine trust in the tool — this is the most literal application yet in the course of "tune temperature to match the task's need for consistency versus creativity."</w:t>
-      </w:r>
-    </w:p>
-    <w:p/>
-    <w:p>
-      <w:r>
-        <w:rPr>
-          <w:b/>
-        </w:rPr>
-        <w:lastRenderedPageBreak/>
         <w:t>Step 6: KernelArguments as a Dual-Purpose Container.</w:t>
       </w:r>
       <w:r>

</xml_diff>